<commit_message>
chore(public): sanitize for public mirror [auto by push-public.sh]
</commit_message>
<xml_diff>
--- a/docs/investor-materials/v1.5/aviation-ops/CTDI-due-diligence-faq-aviation-ops.docx
+++ b/docs/investor-materials/v1.5/aviation-ops/CTDI-due-diligence-faq-aviation-ops.docx
@@ -37,7 +37,7 @@
           <w:i w:val="0"/>
           <w:sz w:val="22"/>
         </w:rPr>
-        <w:t>CS Executive Services, LLC · Arlington, VA · August 2026 · info@csexecutiveservices.com</w:t>
+        <w:t>[operator LLC], LLC · Arlington, VA · August 2026 · info@example.com</w:t>
       </w:r>
     </w:p>
     <w:p>
@@ -199,7 +199,7 @@
           <w:i w:val="0"/>
           <w:sz w:val="22"/>
         </w:rPr>
-        <w:t>Clean where it matters and disclosed where it does not. FAA SWIM (all six services) is real, approved, credentialed access — free to approved subscribers, $0 in fees, verified writing live; the data is not scraped or third-party-brokered. NOAA/NWS weather including the NWWS-OI push channel, FAA TFR, and NAS status are public-domain US Government data. Own-RF ADS-B and ACARS/VDL are the platform's own receivers — owned data with no license terms at all. Needs formalizing, and disclosed as such: Amtrak rides a community API (no federal SWIM equivalent exists for rail); DCA/IAD airport-board data is scraped from undocumented airport-site JSON and used only as a fallback tier (fragile, no SLA). The intended commercial model largely moots redistribution: each client operator holds its own source credentials, and CS Executive Services ships software and a decision-support layer, not redistributed third-party data — with per-source credential-request templates already in the platform's data-source runbook. ADS-B aggregator accounts (FlightAware et al.) are barter, earned by feeding our own receiver data, and are disclosed as such rather than counted as free.</w:t>
+        <w:t>Clean where it matters and disclosed where it does not. FAA SWIM (all six services) is real, approved, credentialed access — free to approved subscribers, $0 in fees, verified writing live; the data is not scraped or third-party-brokered. NOAA/NWS weather including the NWWS-OI push channel, FAA TFR, and NAS status are public-domain US Government data. Own-RF ADS-B and ACARS/VDL are the platform's own receivers — owned data with no license terms at all. Needs formalizing, and disclosed as such: Amtrak rides a community API (no federal SWIM equivalent exists for rail); DCA/IAD airport-board data is scraped from undocumented airport-site JSON and used only as a fallback tier (fragile, no SLA). The intended commercial model largely moots redistribution: each client operator holds its own source credentials, and [operator LLC] ships software and a decision-support layer, not redistributed third-party data — with per-source credential-request templates already in the platform's data-source runbook. ADS-B aggregator accounts (FlightAware et al.) are barter, earned by feeding our own receiver data, and are disclosed as such rather than counted as free.</w:t>
       </w:r>
     </w:p>
     <w:p>
@@ -307,7 +307,7 @@
           <w:i w:val="0"/>
           <w:sz w:val="22"/>
         </w:rPr>
-        <w:t>Now fixed, closing a gap flagged in every prior pass. CTDI adopted Business Source License 1.1 on 2026-08-24 — verified as canonical, unmodified BSL 1.1 text with a correctly-formed parameters block (Licensor: CS Executive Services, LLC; Change Date 2030-08-24; Change License GPL v3-or-later, which satisfies the covenants). Free for all non-production use always; free for personal self-hosting and internal relay/middleware use by an organization of any size, provided that use never serves a fee-based third-party client service; commercial license required for hosted/managed/white-label resale, platform absorption, or any use in connection with a fee-based client service (even invisibly, even bundled into a retainer). Disclosed plainly, matching the repository's own notice: the Additional Use Grant is a working draft currently under legal review and not yet counsel-confirmed.</w:t>
+        <w:t>Now fixed, closing a gap flagged in every prior pass. CTDI adopted Business Source License 1.1 on 2026-08-24 — verified as canonical, unmodified BSL 1.1 text with a correctly-formed parameters block (Licensor: [operator LLC], LLC; Change Date 2030-08-24; Change License GPL v3-or-later, which satisfies the covenants). Free for all non-production use always; free for personal self-hosting and internal relay/middleware use by an organization of any size, provided that use never serves a fee-based third-party client service; commercial license required for hosted/managed/white-label resale, platform absorption, or any use in connection with a fee-based client service (even invisibly, even bundled into a retainer). Disclosed plainly, matching the repository's own notice: the Additional Use Grant is a working draft currently under legal review and not yet counsel-confirmed.</w:t>
       </w:r>
     </w:p>
     <w:p>
@@ -415,7 +415,7 @@
           <w:i w:val="0"/>
           <w:sz w:val="22"/>
         </w:rPr>
-        <w:t>Not real yet, stated plainly. Today there is a single SQLite database, single-tenant operation, and only a token-level department field plus feed-visibility scoping. White-label today means redeploy-per-operator (real install tooling exists), not a config toggle. Tenant isolation, per-tenant branding, and billing/entitlements are roadmap. The intended data-rights model — each client holds its own SWIM/NWS/NOTAM credentials while CS Executive Services ships software — is template-supported today (per-source credential-request templates exist) but the automated tenant onboarding machinery is not built.</w:t>
+        <w:t>Not real yet, stated plainly. Today there is a single SQLite database, single-tenant operation, and only a token-level department field plus feed-visibility scoping. White-label today means redeploy-per-operator (real install tooling exists), not a config toggle. Tenant isolation, per-tenant branding, and billing/entitlements are roadmap. The intended data-rights model — each client holds its own SWIM/NWS/NOTAM credentials while [operator LLC] ships software — is template-supported today (per-source credential-request templates exist) but the automated tenant onboarding machinery is not built.</w:t>
       </w:r>
     </w:p>
     <w:p>
@@ -433,7 +433,7 @@
           <w:i w:val="0"/>
           <w:sz w:val="22"/>
         </w:rPr>
-        <w:t>All 635 commits are by the founder, Corey Sheldon (USMC veteran; owner, CS Executive Services, LLC, Arlington, VA), who designed, built, secured, and operates the entire stack and dispatches on it daily — genuine founder-market fit in a discreet, trust-driven vertical. Formal assignment of the IP into CS Executive Services, LLC and the terms of that assignment: needs founder input. No patents are claimed. The security controls (bearer-token auth, audit trail, signed manifest, scrub gates) are the founder's daily working environment, not a compliance checkbox.</w:t>
+        <w:t>All 635 commits are by the founder, the operator (USMC veteran; owner, [operator LLC], LLC, Arlington, VA), who designed, built, secured, and operates the entire stack and dispatches on it daily — genuine founder-market fit in a discreet, trust-driven vertical. Formal assignment of the IP into [operator LLC], LLC and the terms of that assignment: needs founder input. No patents are claimed. The security controls (bearer-token auth, audit trail, signed manifest, scrub gates) are the founder's daily working environment, not a compliance checkbox.</w:t>
       </w:r>
     </w:p>
     <w:p>

</xml_diff>